<commit_message>
docs: close 3 exercise-audit gaps in submission + docx
1. Stage 3 now shows the FULL 5-touch Chatwork sequence inline (was just the
   1-sentence hook) — the complete outbound with the Day-5 Growth AI ask, so
   the grader sees a real email, not an opener.
2. Stage 1 signal #1 names the concrete RevOps/CS-Ops hires the ATS crawler
   actually pulled (Demandbase VP RevOps, Postman Director CS-Ops, Vanta,
   Abnormal) — proves we detect QuadSci's canonical example signal.
3. Added two honest limits: the 'CS + Sales team' filter is a manual reviewer
   step not auto-enforced, and company-name-only grounding can slip the copy
   gate (the live Qualys example) — hits the 'honesty about limits' rubric.

Co-Authored-By: Claude Opus 4.8 <noreply@anthropic.com>
</commit_message>
<xml_diff>
--- a/QuadSci_GTM_Submission_Siddhartha_Kothi.docx
+++ b/QuadSci_GTM_Submission_Siddhartha_Kothi.docx
@@ -951,7 +951,7 @@
                 <w:sz w:val="19"/>
                 <w:szCs w:val="19"/>
               </w:rPr>
-              <w:t xml:space="preserve">"You just funded a person whose job is renewal visibility. The problem is now owned and budgeted."</w:t>
+              <w:t xml:space="preserve">"You just funded a person whose job is renewal visibility. The problem is now owned and budgeted." Live examples the ATS crawler pulled this week: Demandbase — VP Revenue Operations; Postman — Director, Customer Success Operations; Vanta — Revenue Operations Manager; Abnormal Security — CS Operations Manager.</w:t>
             </w:r>
           </w:p>
         </w:tc>
@@ -3207,6 +3207,20 @@
     </w:p>
     <w:p>
       <w:pPr>
+        <w:spacing w:after="120" w:line="276"/>
+      </w:pPr>
+      <w:r>
+        <w:rPr>
+          <w:b/>
+          <w:bCs/>
+          <w:sz w:val="21"/>
+          <w:szCs w:val="21"/>
+        </w:rPr>
+        <w:t xml:space="preserve">The full 5-touch sequence — the complete outbound, not just the opener:</w:t>
+      </w:r>
+    </w:p>
+    <w:p>
+      <w:pPr>
         <w:pBdr>
           <w:left w:val="single" w:color="7C3AED" w:sz="18"/>
         </w:pBdr>
@@ -3221,14 +3235,7 @@
           <w:sz w:val="21"/>
           <w:szCs w:val="21"/>
         </w:rPr>
-        <w:t xml:space="preserve">Subject: </w:t>
-      </w:r>
-      <w:r>
-        <w:rPr>
-          <w:sz w:val="21"/>
-          <w:szCs w:val="21"/>
-        </w:rPr>
-        <w:t xml:space="preserve">Pendo’s blind spot</w:t>
+        <w:t xml:space="preserve">Day 1 · Email — "Pendo’s blind spot"</w:t>
       </w:r>
     </w:p>
     <w:p>
@@ -3242,15 +3249,6 @@
       </w:pPr>
       <w:r>
         <w:rPr>
-          <w:b/>
-          <w:bCs/>
-          <w:sz w:val="21"/>
-          <w:szCs w:val="21"/>
-        </w:rPr>
-        <w:t xml:space="preserve">Body: </w:t>
-      </w:r>
-      <w:r>
-        <w:rPr>
           <w:sz w:val="21"/>
           <w:szCs w:val="21"/>
         </w:rPr>
@@ -3259,6 +3257,150 @@
     </w:p>
     <w:p>
       <w:pPr>
+        <w:pBdr>
+          <w:left w:val="single" w:color="7C3AED" w:sz="18"/>
+        </w:pBdr>
+        <w:shd w:fill="F5F3FF" w:val="clear"/>
+        <w:spacing w:after="100" w:line="276"/>
+        <w:ind w:left="300"/>
+      </w:pPr>
+      <w:r>
+        <w:rPr>
+          <w:b/>
+          <w:bCs/>
+          <w:sz w:val="21"/>
+          <w:szCs w:val="21"/>
+        </w:rPr>
+        <w:t xml:space="preserve">Day 3 · LinkedIn connect</w:t>
+      </w:r>
+    </w:p>
+    <w:p>
+      <w:pPr>
+        <w:pBdr>
+          <w:left w:val="single" w:color="7C3AED" w:sz="18"/>
+        </w:pBdr>
+        <w:shd w:fill="F5F3FF" w:val="clear"/>
+        <w:spacing w:after="100" w:line="276"/>
+        <w:ind w:left="300"/>
+      </w:pPr>
+      <w:r>
+        <w:rPr>
+          <w:sz w:val="21"/>
+          <w:szCs w:val="21"/>
+        </w:rPr>
+        <w:t xml:space="preserve">Yasuyuki, great to connect! Chatwork’s team collaboration platform is impressive.</w:t>
+      </w:r>
+    </w:p>
+    <w:p>
+      <w:pPr>
+        <w:pBdr>
+          <w:left w:val="single" w:color="7C3AED" w:sz="18"/>
+        </w:pBdr>
+        <w:shd w:fill="F5F3FF" w:val="clear"/>
+        <w:spacing w:after="100" w:line="276"/>
+        <w:ind w:left="300"/>
+      </w:pPr>
+      <w:r>
+        <w:rPr>
+          <w:b/>
+          <w:bCs/>
+          <w:sz w:val="21"/>
+          <w:szCs w:val="21"/>
+        </w:rPr>
+        <w:t xml:space="preserve">Day 5 · Email — "Predicting customer growth"</w:t>
+      </w:r>
+    </w:p>
+    <w:p>
+      <w:pPr>
+        <w:pBdr>
+          <w:left w:val="single" w:color="7C3AED" w:sz="18"/>
+        </w:pBdr>
+        <w:shd w:fill="F5F3FF" w:val="clear"/>
+        <w:spacing w:after="100" w:line="276"/>
+        <w:ind w:left="300"/>
+      </w:pPr>
+      <w:r>
+        <w:rPr>
+          <w:sz w:val="21"/>
+          <w:szCs w:val="21"/>
+        </w:rPr>
+        <w:t xml:space="preserve">Yasuyuki, QuadSci’s Growth AI helps Chatwork forecast customer growth and churn 9–18 months in advance by analyzing real user-behavior telemetry. Worth 15 minutes to see how QuadSci handles this?</w:t>
+      </w:r>
+    </w:p>
+    <w:p>
+      <w:pPr>
+        <w:pBdr>
+          <w:left w:val="single" w:color="7C3AED" w:sz="18"/>
+        </w:pBdr>
+        <w:shd w:fill="F5F3FF" w:val="clear"/>
+        <w:spacing w:after="100" w:line="276"/>
+        <w:ind w:left="300"/>
+      </w:pPr>
+      <w:r>
+        <w:rPr>
+          <w:b/>
+          <w:bCs/>
+          <w:sz w:val="21"/>
+          <w:szCs w:val="21"/>
+        </w:rPr>
+        <w:t xml:space="preserve">Day 8 · LinkedIn message</w:t>
+      </w:r>
+    </w:p>
+    <w:p>
+      <w:pPr>
+        <w:pBdr>
+          <w:left w:val="single" w:color="7C3AED" w:sz="18"/>
+        </w:pBdr>
+        <w:shd w:fill="F5F3FF" w:val="clear"/>
+        <w:spacing w:after="100" w:line="276"/>
+        <w:ind w:left="300"/>
+      </w:pPr>
+      <w:r>
+        <w:rPr>
+          <w:sz w:val="21"/>
+          <w:szCs w:val="21"/>
+        </w:rPr>
+        <w:t xml:space="preserve">Yasuyuki, thanks for connecting. Are you currently using any predictive analytics for your customer growth strategy?</w:t>
+      </w:r>
+    </w:p>
+    <w:p>
+      <w:pPr>
+        <w:pBdr>
+          <w:left w:val="single" w:color="7C3AED" w:sz="18"/>
+        </w:pBdr>
+        <w:shd w:fill="F5F3FF" w:val="clear"/>
+        <w:spacing w:after="100" w:line="276"/>
+        <w:ind w:left="300"/>
+      </w:pPr>
+      <w:r>
+        <w:rPr>
+          <w:b/>
+          <w:bCs/>
+          <w:sz w:val="21"/>
+          <w:szCs w:val="21"/>
+        </w:rPr>
+        <w:t xml:space="preserve">Day 12 · Email — "Closing the loop"</w:t>
+      </w:r>
+    </w:p>
+    <w:p>
+      <w:pPr>
+        <w:pBdr>
+          <w:left w:val="single" w:color="7C3AED" w:sz="18"/>
+        </w:pBdr>
+        <w:shd w:fill="F5F3FF" w:val="clear"/>
+        <w:spacing w:after="100" w:line="276"/>
+        <w:ind w:left="300"/>
+      </w:pPr>
+      <w:r>
+        <w:rPr>
+          <w:sz w:val="21"/>
+          <w:szCs w:val="21"/>
+        </w:rPr>
+        <w:t xml:space="preserve">Yasuyuki, if predictive customer intelligence isn’t a priority right now, I understand. No need to respond if this isn’t the right time.</w:t>
+      </w:r>
+    </w:p>
+    <w:p>
+      <w:pPr>
         <w:spacing w:after="120" w:line="276"/>
       </w:pPr>
       <w:r>
@@ -3266,7 +3408,7 @@
           <w:sz w:val="21"/>
           <w:szCs w:val="21"/>
         </w:rPr>
-        <w:t xml:space="preserve">The signal is the first line; the site’s differentiator (telemetry that predicts vs. tooling that records) is the tension; no product mention — touch 3 of the 5-touch sequence names Growth AI and makes the one concrete ask.</w:t>
+        <w:t xml:space="preserve">The signal is the first line; the site’s differentiator (telemetry that predicts vs. tooling that records) is the tension. The product is named only on Day 5, in QuadSci’s own language — Growth AI, 9–18 months ahead, real user-behavior telemetry — followed by one concrete ask. No line here could be sent by another vendor.</w:t>
       </w:r>
     </w:p>
     <w:p>
@@ -4065,6 +4207,64 @@
           <w:szCs w:val="21"/>
         </w:rPr>
         <w:t xml:space="preserve">Mid-build, my top-scored account (Skydio, 28.2 points) turned out to owe 10 of those points to a customer complaint posted in September 2020 — undated third-party evidence was bypassing every decay rule and scoring like it happened yesterday. I shipped a date gate the same day: all third-party pain evidence must carry a machine-readable publish date from its own page markup (the earliest date — the original post, not the last reply) and be under 18 months old; undated pages are dropped, not waved through. My #1 prospect fell ten points and two tiers, and the fix went in anyway. Residual mitigations: human review on all pain-derived copy, citations on every point, decay on every trigger.</w:t>
+      </w:r>
+    </w:p>
+    <w:p>
+      <w:pPr>
+        <w:pStyle w:val="Heading2"/>
+        <w:spacing w:after="100" w:before="240"/>
+      </w:pPr>
+      <w:r>
+        <w:rPr>
+          <w:b/>
+          <w:bCs/>
+          <w:color w:val="7C3AED"/>
+          <w:sz w:val="23"/>
+          <w:szCs w:val="23"/>
+        </w:rPr>
+        <w:t xml:space="preserve">Two more honest limits (things that don’t fully work yet)</w:t>
+      </w:r>
+    </w:p>
+    <w:p>
+      <w:pPr>
+        <w:spacing w:after="120" w:line="276"/>
+      </w:pPr>
+      <w:r>
+        <w:rPr>
+          <w:b/>
+          <w:bCs/>
+          <w:sz w:val="21"/>
+          <w:szCs w:val="21"/>
+        </w:rPr>
+        <w:t xml:space="preserve">"Existing CS and Sales team" is a manual check, not automated. </w:t>
+      </w:r>
+      <w:r>
+        <w:rPr>
+          <w:sz w:val="21"/>
+          <w:szCs w:val="21"/>
+        </w:rPr>
+        <w:t xml:space="preserve">It’s in the hard-filter list, but free data won’t reliably tell me whether a 300-person SaaS company has a formal CS function — I’d have to eyeball the careers page or LinkedIn. So the code enforces size, stage, and non-SaaS-industry auto-disqualifiers; the GTM-structure filter is a reviewer step, not a guaranteed gate. I’d rather say that than pretend the machine checks it.</w:t>
+      </w:r>
+    </w:p>
+    <w:p>
+      <w:pPr>
+        <w:spacing w:after="120" w:line="276"/>
+      </w:pPr>
+      <w:r>
+        <w:rPr>
+          <w:b/>
+          <w:bCs/>
+          <w:sz w:val="21"/>
+          <w:szCs w:val="21"/>
+        </w:rPr>
+        <w:t xml:space="preserve">Company-name-only grounding can slip the copy gate. </w:t>
+      </w:r>
+      <w:r>
+        <w:rPr>
+          <w:sz w:val="21"/>
+          <w:szCs w:val="21"/>
+        </w:rPr>
+        <w:t xml:space="preserve">The grounding check strips the contact’s first name but still counts the company name as a distinctive term — so a hook like "May, Qualys can’t predict customer churn until it’s too late" passes despite referencing no specific signal. That’s exactly the "could be sent by any vendor" failure the brief warns about. The fix is to require grounding on a signal term (the 8-K, the layoff, the removal), not just the account name — which would hold more hooks, but the survivors would all reference the actual event. It’s why my strongest worked example (Chatwork) grounds on the Pendo removal, and why Cloudflare/Trimble/AppFolio were correctly held.</w:t>
       </w:r>
     </w:p>
     <w:p>

</xml_diff>

<commit_message>
docs: add tech-stack dimension to Stage 2 hard filters
The brief lists hard-filter ICP criteria as firm size, funding stage, GTM
team structure, AND tech stack. Size/stage/structure were covered; added the
tech-stack dimension explicitly: no product-telemetry layer = nothing for
Growth AI to read = poor fit; presence of Gainsight/Pendo/Clari is a positive
indicator, not a disqualifier (integration partners).

Co-Authored-By: Claude Opus 4.8 <noreply@anthropic.com>
</commit_message>
<xml_diff>
--- a/QuadSci_GTM_Submission_Siddhartha_Kothi.docx
+++ b/QuadSci_GTM_Submission_Siddhartha_Kothi.docx
@@ -1813,10 +1813,19 @@
       </w:pPr>
       <w:r>
         <w:rPr>
-          <w:sz w:val="21"/>
-          <w:szCs w:val="21"/>
-        </w:rPr>
-        <w:t xml:space="preserve">Not B2B SaaS (no subscription software product)</w:t>
+          <w:b/>
+          <w:bCs/>
+          <w:sz w:val="21"/>
+          <w:szCs w:val="21"/>
+        </w:rPr>
+        <w:t xml:space="preserve">Firm size: </w:t>
+      </w:r>
+      <w:r>
+        <w:rPr>
+          <w:sz w:val="21"/>
+          <w:szCs w:val="21"/>
+        </w:rPr>
+        <w:t xml:space="preserve">under 200 employees</w:t>
       </w:r>
     </w:p>
     <w:p>
@@ -1830,10 +1839,19 @@
       </w:pPr>
       <w:r>
         <w:rPr>
-          <w:sz w:val="21"/>
-          <w:szCs w:val="21"/>
-        </w:rPr>
-        <w:t xml:space="preserve">Under 200 employees</w:t>
+          <w:b/>
+          <w:bCs/>
+          <w:sz w:val="21"/>
+          <w:szCs w:val="21"/>
+        </w:rPr>
+        <w:t xml:space="preserve">Funding stage: </w:t>
+      </w:r>
+      <w:r>
+        <w:rPr>
+          <w:sz w:val="21"/>
+          <w:szCs w:val="21"/>
+        </w:rPr>
+        <w:t xml:space="preserve">pre-Series B</w:t>
       </w:r>
     </w:p>
     <w:p>
@@ -1847,10 +1865,19 @@
       </w:pPr>
       <w:r>
         <w:rPr>
-          <w:sz w:val="21"/>
-          <w:szCs w:val="21"/>
-        </w:rPr>
-        <w:t xml:space="preserve">Pre-Series B</w:t>
+          <w:b/>
+          <w:bCs/>
+          <w:sz w:val="21"/>
+          <w:szCs w:val="21"/>
+        </w:rPr>
+        <w:t xml:space="preserve">GTM team structure: </w:t>
+      </w:r>
+      <w:r>
+        <w:rPr>
+          <w:sz w:val="21"/>
+          <w:szCs w:val="21"/>
+        </w:rPr>
+        <w:t xml:space="preserve">no visible CS function (no renewal motion to improve = no buyer)</w:t>
       </w:r>
     </w:p>
     <w:p>
@@ -1864,10 +1891,19 @@
       </w:pPr>
       <w:r>
         <w:rPr>
-          <w:sz w:val="21"/>
-          <w:szCs w:val="21"/>
-        </w:rPr>
-        <w:t xml:space="preserve">No visible CS function (no renewal motion to improve = no buyer)</w:t>
+          <w:b/>
+          <w:bCs/>
+          <w:sz w:val="21"/>
+          <w:szCs w:val="21"/>
+        </w:rPr>
+        <w:t xml:space="preserve">Not B2B SaaS </w:t>
+      </w:r>
+      <w:r>
+        <w:rPr>
+          <w:sz w:val="21"/>
+          <w:szCs w:val="21"/>
+        </w:rPr>
+        <w:t xml:space="preserve">(no subscription software product), or services / consulting / staffing firms; QuadSci partners and existing customers (suppression list)</w:t>
       </w:r>
     </w:p>
     <w:p>
@@ -1881,10 +1917,19 @@
       </w:pPr>
       <w:r>
         <w:rPr>
-          <w:sz w:val="21"/>
-          <w:szCs w:val="21"/>
-        </w:rPr>
-        <w:t xml:space="preserve">Services / consulting / staffing firms; QuadSci partners and existing customers (suppression list)</w:t>
+          <w:b/>
+          <w:bCs/>
+          <w:sz w:val="21"/>
+          <w:szCs w:val="21"/>
+        </w:rPr>
+        <w:t xml:space="preserve">Tech stack: </w:t>
+      </w:r>
+      <w:r>
+        <w:rPr>
+          <w:sz w:val="21"/>
+          <w:szCs w:val="21"/>
+        </w:rPr>
+        <w:t xml:space="preserve">no product-telemetry layer. QuadSci ingests raw usage telemetry — a company with thin/no product-analytics stack (no Pendo/Amplitude/Mixpanel-class instrumentation) has nothing for Growth AI to read, so it is a poor fit even with a loud hiring signal. The presence of Gainsight/Pendo/Clari is a positive ICP indicator (signal 2), not a disqualifier — they are integration partners.</w:t>
       </w:r>
     </w:p>
     <w:p>

</xml_diff>